<commit_message>
Update РО БАСР.00360-01 34 01.docx
</commit_message>
<xml_diff>
--- a/docs/РО БАСР.00360-01 34 01.docx
+++ b/docs/РО БАСР.00360-01 34 01.docx
@@ -85,7 +85,7 @@
               </wp:anchor>
             </w:drawing>
           </mc:Choice>
-          <mc:Fallback xmlns:w16sdtfl="http://schemas.microsoft.com/office/word/2024/wordml/sdtformatlock" xmlns:w16du="http://schemas.microsoft.com/office/word/2023/wordml/word16du" xmlns:oel="http://schemas.microsoft.com/office/2019/extlst">
+          <mc:Fallback xmlns:oel="http://schemas.microsoft.com/office/2019/extlst" xmlns:w16du="http://schemas.microsoft.com/office/word/2023/wordml/word16du" xmlns:w16sdtfl="http://schemas.microsoft.com/office/word/2024/wordml/sdtformatlock">
             <w:pict>
               <v:rect w14:anchorId="4587C1F2" id="Rectangle 30" o:spid="_x0000_s1026" style="position:absolute;margin-left:351pt;margin-top:-27pt;width:126pt;height:27pt;z-index:251659264;visibility:visible;mso-wrap-style:square;mso-width-percent:0;mso-height-percent:0;mso-wrap-distance-left:9pt;mso-wrap-distance-top:0;mso-wrap-distance-right:9pt;mso-wrap-distance-bottom:0;mso-position-horizontal:absolute;mso-position-horizontal-relative:text;mso-position-vertical:absolute;mso-position-vertical-relative:text;mso-width-percent:0;mso-height-percent:0;mso-width-relative:page;mso-height-relative:page;v-text-anchor:top" o:gfxdata="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" stroked="f"/>
             </w:pict>
@@ -7129,23 +7129,224 @@
     </w:p>
     <w:p>
       <w:pPr>
-        <w:ind w:firstLine="0"/>
-        <w:jc w:val="center"/>
+        <w:pStyle w:val="affff0"/>
       </w:pPr>
     </w:p>
     <w:p>
       <w:pPr>
-        <w:rPr>
-          <w:lang w:eastAsia="en-US"/>
-        </w:rPr>
+        <w:pStyle w:val="affff0"/>
       </w:pPr>
     </w:p>
     <w:p>
       <w:pPr>
+        <w:pStyle w:val="2a"/>
+        <w:numPr>
+          <w:ilvl w:val="1"/>
+          <w:numId w:val="29"/>
+        </w:numPr>
+      </w:pPr>
+      <w:r>
+        <w:t>Поиск областей</w:t>
+      </w:r>
+    </w:p>
+    <w:p>
+      <w:pPr>
         <w:rPr>
           <w:lang w:eastAsia="en-US"/>
         </w:rPr>
       </w:pPr>
+      <w:r>
+        <w:rPr>
+          <w:lang w:eastAsia="en-US"/>
+        </w:rPr>
+        <w:t>Поиск областей можно осуществлять, используя Евклидову метрику или спектральный угол. Для этого достаточно выбрать метод поиска и пороговое значение. После выбора параметров нажать кнопку «Запуск поиска».</w:t>
+      </w:r>
+      <w:r>
+        <w:rPr>
+          <w:lang w:eastAsia="en-US"/>
+        </w:rPr>
+        <w:t xml:space="preserve"> Перед поиском появляется диалоговое окно, предлагающее оператору выбрать </w:t>
+      </w:r>
+      <w:r>
+        <w:rPr>
+          <w:lang w:eastAsia="en-US"/>
+        </w:rPr>
+        <w:t>цвет,</w:t>
+      </w:r>
+      <w:r>
+        <w:rPr>
+          <w:lang w:eastAsia="en-US"/>
+        </w:rPr>
+        <w:t xml:space="preserve"> которым будут закрашены </w:t>
+      </w:r>
+      <w:r>
+        <w:rPr>
+          <w:lang w:eastAsia="en-US"/>
+        </w:rPr>
+        <w:t>области,</w:t>
+      </w:r>
+      <w:r>
+        <w:rPr>
+          <w:lang w:eastAsia="en-US"/>
+        </w:rPr>
+        <w:t xml:space="preserve"> соответствующие критерию поиска.</w:t>
+      </w:r>
+    </w:p>
+    <w:p>
+      <w:pPr>
+        <w:rPr>
+          <w:lang w:eastAsia="en-US"/>
+        </w:rPr>
+      </w:pPr>
+      <w:r>
+        <w:rPr>
+          <w:lang w:eastAsia="en-US"/>
+        </w:rPr>
+        <w:drawing>
+          <wp:inline distT="0" distB="0" distL="0" distR="0" wp14:anchorId="778D4546" wp14:editId="2522C466">
+            <wp:extent cx="4162425" cy="3605867"/>
+            <wp:effectExtent l="0" t="0" r="0" b="0"/>
+            <wp:docPr id="6" name="Рисунок 6"/>
+            <wp:cNvGraphicFramePr>
+              <a:graphicFrameLocks xmlns:a="http://schemas.openxmlformats.org/drawingml/2006/main" noChangeAspect="1"/>
+            </wp:cNvGraphicFramePr>
+            <a:graphic xmlns:a="http://schemas.openxmlformats.org/drawingml/2006/main">
+              <a:graphicData uri="http://schemas.openxmlformats.org/drawingml/2006/picture">
+                <pic:pic xmlns:pic="http://schemas.openxmlformats.org/drawingml/2006/picture">
+                  <pic:nvPicPr>
+                    <pic:cNvPr id="1" name=""/>
+                    <pic:cNvPicPr/>
+                  </pic:nvPicPr>
+                  <pic:blipFill>
+                    <a:blip r:embed="rId22"/>
+                    <a:stretch>
+                      <a:fillRect/>
+                    </a:stretch>
+                  </pic:blipFill>
+                  <pic:spPr>
+                    <a:xfrm>
+                      <a:off x="0" y="0"/>
+                      <a:ext cx="4166312" cy="3609234"/>
+                    </a:xfrm>
+                    <a:prstGeom prst="rect">
+                      <a:avLst/>
+                    </a:prstGeom>
+                  </pic:spPr>
+                </pic:pic>
+              </a:graphicData>
+            </a:graphic>
+          </wp:inline>
+        </w:drawing>
+      </w:r>
+    </w:p>
+    <w:p>
+      <w:pPr>
+        <w:rPr>
+          <w:lang w:eastAsia="en-US"/>
+        </w:rPr>
+      </w:pPr>
+    </w:p>
+    <w:p>
+      <w:pPr>
+        <w:rPr>
+          <w:lang w:eastAsia="en-US"/>
+        </w:rPr>
+      </w:pPr>
+      <w:r>
+        <w:rPr>
+          <w:lang w:eastAsia="en-US"/>
+        </w:rPr>
+        <w:t>Рисунок 3.5.1 Диалоговое окно выбора цвета</w:t>
+      </w:r>
+    </w:p>
+    <w:p>
+      <w:pPr>
+        <w:rPr>
+          <w:lang w:eastAsia="en-US"/>
+        </w:rPr>
+      </w:pPr>
+    </w:p>
+    <w:p>
+      <w:pPr>
+        <w:rPr>
+          <w:lang w:eastAsia="en-US"/>
+        </w:rPr>
+      </w:pPr>
+      <w:r>
+        <w:rPr>
+          <w:lang w:eastAsia="en-US"/>
+        </w:rPr>
+        <w:lastRenderedPageBreak/>
+        <w:t xml:space="preserve">Примеры результатов поиска воды и </w:t>
+      </w:r>
+      <w:r>
+        <w:rPr>
+          <w:lang w:eastAsia="en-US"/>
+        </w:rPr>
+        <w:t>леса.</w:t>
+      </w:r>
+    </w:p>
+    <w:p>
+      <w:pPr>
+        <w:ind w:firstLine="0"/>
+        <w:rPr>
+          <w:lang w:eastAsia="en-US"/>
+        </w:rPr>
+      </w:pPr>
+      <w:r>
+        <w:rPr>
+          <w:lang w:eastAsia="en-US"/>
+        </w:rPr>
+        <w:drawing>
+          <wp:inline distT="0" distB="0" distL="0" distR="0" wp14:anchorId="58199E68" wp14:editId="3CFEF266">
+            <wp:extent cx="6120130" cy="3322955"/>
+            <wp:effectExtent l="0" t="0" r="0" b="0"/>
+            <wp:docPr id="7" name="Рисунок 7"/>
+            <wp:cNvGraphicFramePr>
+              <a:graphicFrameLocks xmlns:a="http://schemas.openxmlformats.org/drawingml/2006/main" noChangeAspect="1"/>
+            </wp:cNvGraphicFramePr>
+            <a:graphic xmlns:a="http://schemas.openxmlformats.org/drawingml/2006/main">
+              <a:graphicData uri="http://schemas.openxmlformats.org/drawingml/2006/picture">
+                <pic:pic xmlns:pic="http://schemas.openxmlformats.org/drawingml/2006/picture">
+                  <pic:nvPicPr>
+                    <pic:cNvPr id="1" name=""/>
+                    <pic:cNvPicPr/>
+                  </pic:nvPicPr>
+                  <pic:blipFill>
+                    <a:blip r:embed="rId23"/>
+                    <a:stretch>
+                      <a:fillRect/>
+                    </a:stretch>
+                  </pic:blipFill>
+                  <pic:spPr>
+                    <a:xfrm>
+                      <a:off x="0" y="0"/>
+                      <a:ext cx="6120130" cy="3322955"/>
+                    </a:xfrm>
+                    <a:prstGeom prst="rect">
+                      <a:avLst/>
+                    </a:prstGeom>
+                  </pic:spPr>
+                </pic:pic>
+              </a:graphicData>
+            </a:graphic>
+          </wp:inline>
+        </w:drawing>
+      </w:r>
+    </w:p>
+    <w:p>
+      <w:pPr>
+        <w:jc w:val="center"/>
+        <w:rPr>
+          <w:lang w:eastAsia="en-US"/>
+        </w:rPr>
+      </w:pPr>
+      <w:r>
+        <w:rPr>
+          <w:lang w:eastAsia="en-US"/>
+        </w:rPr>
+        <w:t>Рисунок 3.5.2 Результаты поиска</w:t>
+      </w:r>
     </w:p>
     <w:p>
       <w:pPr>
@@ -7308,7 +7509,7 @@
                     </pic:cNvPicPr>
                   </pic:nvPicPr>
                   <pic:blipFill>
-                    <a:blip r:embed="rId22">
+                    <a:blip r:embed="rId24">
                       <a:extLst>
                         <a:ext uri="{28A0092B-C50C-407E-A947-70E740481C1C}">
                           <a14:useLocalDpi xmlns:a14="http://schemas.microsoft.com/office/drawing/2010/main" val="0"/>
@@ -7394,7 +7595,7 @@
                     </pic:cNvPicPr>
                   </pic:nvPicPr>
                   <pic:blipFill>
-                    <a:blip r:embed="rId23">
+                    <a:blip r:embed="rId25">
                       <a:extLst>
                         <a:ext uri="{28A0092B-C50C-407E-A947-70E740481C1C}">
                           <a14:useLocalDpi xmlns:a14="http://schemas.microsoft.com/office/drawing/2010/main" val="0"/>
@@ -13937,10 +14138,10 @@
       </w:pPr>
     </w:p>
     <w:sectPr>
-      <w:headerReference w:type="default" r:id="rId24"/>
-      <w:footerReference w:type="default" r:id="rId25"/>
-      <w:headerReference w:type="first" r:id="rId26"/>
-      <w:footerReference w:type="first" r:id="rId27"/>
+      <w:headerReference w:type="default" r:id="rId26"/>
+      <w:footerReference w:type="default" r:id="rId27"/>
+      <w:headerReference w:type="first" r:id="rId28"/>
+      <w:footerReference w:type="first" r:id="rId29"/>
       <w:pgSz w:w="11906" w:h="16838" w:code="9"/>
       <w:pgMar w:top="482" w:right="567" w:bottom="709" w:left="1701" w:header="0" w:footer="0" w:gutter="0"/>
       <w:pgNumType w:start="2"/>
@@ -15833,7 +16034,7 @@
             </wp:anchor>
           </w:drawing>
         </mc:Choice>
-        <mc:Fallback xmlns:w16sdtfl="http://schemas.microsoft.com/office/word/2024/wordml/sdtformatlock" xmlns:w16du="http://schemas.microsoft.com/office/word/2023/wordml/word16du" xmlns:oel="http://schemas.microsoft.com/office/2019/extlst">
+        <mc:Fallback xmlns:oel="http://schemas.microsoft.com/office/2019/extlst" xmlns:w16du="http://schemas.microsoft.com/office/word/2023/wordml/word16du" xmlns:w16sdtfl="http://schemas.microsoft.com/office/word/2024/wordml/sdtformatlock">
           <w:pict>
             <v:line w14:anchorId="11AF9961" id="Прямая соединительная линия 7440" o:spid="_x0000_s1026" style="position:absolute;z-index:251675136;visibility:visible;mso-wrap-style:square;mso-width-percent:0;mso-height-percent:0;mso-wrap-distance-left:9pt;mso-wrap-distance-top:-3e-5mm;mso-wrap-distance-right:9pt;mso-wrap-distance-bottom:-3e-5mm;mso-position-horizontal:absolute;mso-position-horizontal-relative:text;mso-position-vertical:absolute;mso-position-vertical-relative:text;mso-width-percent:0;mso-height-percent:0;mso-width-relative:page;mso-height-relative:page" from="-51.05pt,-45.1pt" to="-14.2pt,-45.1pt" o:gfxdata="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" o:allowincell="f" strokeweight="2pt"/>
           </w:pict>
@@ -15907,7 +16108,7 @@
             </wp:anchor>
           </w:drawing>
         </mc:Choice>
-        <mc:Fallback xmlns:w16sdtfl="http://schemas.microsoft.com/office/word/2024/wordml/sdtformatlock" xmlns:w16du="http://schemas.microsoft.com/office/word/2023/wordml/word16du" xmlns:oel="http://schemas.microsoft.com/office/2019/extlst">
+        <mc:Fallback xmlns:oel="http://schemas.microsoft.com/office/2019/extlst" xmlns:w16du="http://schemas.microsoft.com/office/word/2023/wordml/word16du" xmlns:w16sdtfl="http://schemas.microsoft.com/office/word/2024/wordml/sdtformatlock">
           <w:pict>
             <v:line w14:anchorId="57DC6D6F" id="Прямая соединительная линия 7439" o:spid="_x0000_s1026" style="position:absolute;z-index:251674112;visibility:visible;mso-wrap-style:square;mso-width-percent:0;mso-height-percent:0;mso-wrap-distance-left:9pt;mso-wrap-distance-top:-3e-5mm;mso-wrap-distance-right:9pt;mso-wrap-distance-bottom:-3e-5mm;mso-position-horizontal:absolute;mso-position-horizontal-relative:text;mso-position-vertical:absolute;mso-position-vertical-relative:text;mso-width-percent:0;mso-height-percent:0;mso-width-relative:page;mso-height-relative:page" from="-51.05pt,-144.35pt" to="-14.2pt,-144.35pt" o:gfxdata="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" o:allowincell="f" strokeweight="2pt"/>
           </w:pict>
@@ -15981,7 +16182,7 @@
             </wp:anchor>
           </w:drawing>
         </mc:Choice>
-        <mc:Fallback xmlns:w16sdtfl="http://schemas.microsoft.com/office/word/2024/wordml/sdtformatlock" xmlns:w16du="http://schemas.microsoft.com/office/word/2023/wordml/word16du" xmlns:oel="http://schemas.microsoft.com/office/2019/extlst">
+        <mc:Fallback xmlns:oel="http://schemas.microsoft.com/office/2019/extlst" xmlns:w16du="http://schemas.microsoft.com/office/word/2023/wordml/word16du" xmlns:w16sdtfl="http://schemas.microsoft.com/office/word/2024/wordml/sdtformatlock">
           <w:pict>
             <v:line w14:anchorId="20B3CAF0" id="Прямая соединительная линия 7438" o:spid="_x0000_s1026" style="position:absolute;z-index:251673088;visibility:visible;mso-wrap-style:square;mso-width-percent:0;mso-height-percent:0;mso-wrap-distance-left:9pt;mso-wrap-distance-top:-3e-5mm;mso-wrap-distance-right:9pt;mso-wrap-distance-bottom:-3e-5mm;mso-position-horizontal:absolute;mso-position-horizontal-relative:text;mso-position-vertical:absolute;mso-position-vertical-relative:text;mso-width-percent:0;mso-height-percent:0;mso-width-relative:page;mso-height-relative:page" from="-51.05pt,-215.2pt" to="-14.2pt,-215.2pt" o:gfxdata="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" o:allowincell="f" strokeweight="2pt"/>
           </w:pict>
@@ -16055,7 +16256,7 @@
             </wp:anchor>
           </w:drawing>
         </mc:Choice>
-        <mc:Fallback xmlns:w16sdtfl="http://schemas.microsoft.com/office/word/2024/wordml/sdtformatlock" xmlns:w16du="http://schemas.microsoft.com/office/word/2023/wordml/word16du" xmlns:oel="http://schemas.microsoft.com/office/2019/extlst">
+        <mc:Fallback xmlns:oel="http://schemas.microsoft.com/office/2019/extlst" xmlns:w16du="http://schemas.microsoft.com/office/word/2023/wordml/word16du" xmlns:w16sdtfl="http://schemas.microsoft.com/office/word/2024/wordml/sdtformatlock">
           <w:pict>
             <v:line w14:anchorId="664A659F" id="Прямая соединительная линия 7437" o:spid="_x0000_s1026" style="position:absolute;z-index:251672064;visibility:visible;mso-wrap-style:square;mso-width-percent:0;mso-height-percent:0;mso-wrap-distance-left:9pt;mso-wrap-distance-top:-3e-5mm;mso-wrap-distance-right:9pt;mso-wrap-distance-bottom:-3e-5mm;mso-position-horizontal:absolute;mso-position-horizontal-relative:text;mso-position-vertical:absolute;mso-position-vertical-relative:text;mso-width-percent:0;mso-height-percent:0;mso-width-relative:page;mso-height-relative:page" from="-51.05pt,-286.1pt" to="-14.2pt,-286.1pt" o:gfxdata="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" o:allowincell="f" strokeweight="2pt"/>
           </w:pict>
@@ -17138,8 +17339,8 @@
             <w:lang w:val="ru-RU"/>
           </w:rPr>
         </w:pPr>
-        <w:bookmarkStart w:id="7" w:name="_Hlk199924287"/>
-        <w:bookmarkStart w:id="8" w:name="_Hlk199924288"/>
+        <w:bookmarkStart w:id="7" w:name="_Hlk199924288"/>
+        <w:bookmarkStart w:id="8" w:name="_Hlk199924287"/>
         <w:r>
           <w:rPr>
             <w:bCs/>
@@ -17591,7 +17792,7 @@
             </wp:anchor>
           </w:drawing>
         </mc:Choice>
-        <mc:Fallback xmlns:w16sdtfl="http://schemas.microsoft.com/office/word/2024/wordml/sdtformatlock" xmlns:w16du="http://schemas.microsoft.com/office/word/2023/wordml/word16du" xmlns:oel="http://schemas.microsoft.com/office/2019/extlst">
+        <mc:Fallback xmlns:oel="http://schemas.microsoft.com/office/2019/extlst" xmlns:w16du="http://schemas.microsoft.com/office/word/2023/wordml/word16du" xmlns:w16sdtfl="http://schemas.microsoft.com/office/word/2024/wordml/sdtformatlock">
           <w:pict>
             <v:line w14:anchorId="42D1BDC4" id="Прямая соединительная линия 7469" o:spid="_x0000_s1026" style="position:absolute;z-index:251671040;visibility:visible;mso-wrap-style:square;mso-width-percent:0;mso-height-percent:0;mso-wrap-distance-left:3.17497mm;mso-wrap-distance-top:0;mso-wrap-distance-right:3.17497mm;mso-wrap-distance-bottom:0;mso-position-horizontal:absolute;mso-position-horizontal-relative:text;mso-position-vertical:absolute;mso-position-vertical-relative:text;mso-width-percent:0;mso-height-percent:0;mso-width-relative:page;mso-height-relative:page" from="-34.05pt,377.1pt" to="-34.05pt,788.1pt" o:gfxdata="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" o:allowincell="f" strokeweight="2pt"/>
           </w:pict>
@@ -17669,7 +17870,7 @@
             </wp:anchor>
           </w:drawing>
         </mc:Choice>
-        <mc:Fallback xmlns:w16sdtfl="http://schemas.microsoft.com/office/word/2024/wordml/sdtformatlock" xmlns:w16du="http://schemas.microsoft.com/office/word/2023/wordml/word16du" xmlns:oel="http://schemas.microsoft.com/office/2019/extlst">
+        <mc:Fallback xmlns:oel="http://schemas.microsoft.com/office/2019/extlst" xmlns:w16du="http://schemas.microsoft.com/office/word/2023/wordml/word16du" xmlns:w16sdtfl="http://schemas.microsoft.com/office/word/2024/wordml/sdtformatlock">
           <w:pict>
             <v:rect w14:anchorId="02CE86AC" id="Прямоугольник 7468" o:spid="_x0000_s1026" style="position:absolute;margin-left:-51.05pt;margin-top:377.1pt;width:36.85pt;height:411pt;z-index:251670016;visibility:visible;mso-wrap-style:square;mso-width-percent:0;mso-height-percent:0;mso-wrap-distance-left:9pt;mso-wrap-distance-top:0;mso-wrap-distance-right:9pt;mso-wrap-distance-bottom:0;mso-position-horizontal:absolute;mso-position-horizontal-relative:text;mso-position-vertical:absolute;mso-position-vertical-relative:text;mso-width-percent:0;mso-height-percent:0;mso-width-relative:page;mso-height-relative:page;v-text-anchor:top" o:gfxdata="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" o:allowincell="f" filled="f" strokeweight="2pt"/>
           </w:pict>

</xml_diff>